<commit_message>
Set up FormSubmit and rename careers section
</commit_message>
<xml_diff>
--- a/docs/Website_Editing_and_Publishing_Manual.docx
+++ b/docs/Website_Editing_and_Publishing_Manual.docx
@@ -22342,7 +22342,13 @@
           <w:rFonts w:ascii="Century Gothic" w:hAnsi="Century Gothic"/>
         </w:rPr>
         <w:lastRenderedPageBreak/>
-        <w:t>Jobs page</w:t>
+        <w:t>Career</w:t>
+      </w:r>
+      <w:r>
+        <w:rPr>
+          <w:rFonts w:ascii="Century Gothic" w:hAnsi="Century Gothic"/>
+        </w:rPr>
+        <w:t xml:space="preserve"> page</w:t>
       </w:r>
       <w:bookmarkEnd w:id="11"/>
     </w:p>
@@ -22462,7 +22468,13 @@
               <w:rPr>
                 <w:rFonts w:ascii="Century Gothic" w:hAnsi="Century Gothic"/>
               </w:rPr>
-              <w:t>Jobs hero image</w:t>
+              <w:t>Career</w:t>
+            </w:r>
+            <w:r>
+              <w:rPr>
+                <w:rFonts w:ascii="Century Gothic" w:hAnsi="Century Gothic"/>
+              </w:rPr>
+              <w:t xml:space="preserve"> hero image</w:t>
             </w:r>
           </w:p>
         </w:tc>
@@ -22484,6 +22496,7 @@
                 <w:rFonts w:ascii="Century Gothic" w:hAnsi="Century Gothic"/>
               </w:rPr>
             </w:pPr>
+            <w:proofErr w:type="spellStart"/>
             <w:r>
               <w:rPr>
                 <w:rFonts w:ascii="Century Gothic" w:hAnsi="Century Gothic"/>
@@ -22492,6 +22505,7 @@
               </w:rPr>
               <w:t>src</w:t>
             </w:r>
+            <w:proofErr w:type="spellEnd"/>
             <w:r>
               <w:rPr>
                 <w:rFonts w:ascii="Century Gothic" w:hAnsi="Century Gothic"/>
@@ -22522,7 +22536,7 @@
                 <w:color w:val="8A684A"/>
                 <w:shd w:val="clear" w:color="auto" w:fill="F5F0EB"/>
               </w:rPr>
-              <w:t>jobs</w:t>
+              <w:t>career</w:t>
             </w:r>
             <w:r>
               <w:rPr>
@@ -22585,7 +22599,13 @@
               <w:rPr>
                 <w:rFonts w:ascii="Century Gothic" w:hAnsi="Century Gothic"/>
               </w:rPr>
-              <w:t>Job listings</w:t>
+              <w:t>Career</w:t>
+            </w:r>
+            <w:r>
+              <w:rPr>
+                <w:rFonts w:ascii="Century Gothic" w:hAnsi="Century Gothic"/>
+              </w:rPr>
+              <w:t xml:space="preserve"> listings</w:t>
             </w:r>
             <w:r>
               <w:rPr>
@@ -22619,6 +22639,7 @@
                 <w:rFonts w:ascii="Century Gothic" w:hAnsi="Century Gothic"/>
               </w:rPr>
             </w:pPr>
+            <w:proofErr w:type="spellStart"/>
             <w:r>
               <w:rPr>
                 <w:rFonts w:ascii="Century Gothic" w:hAnsi="Century Gothic"/>
@@ -22627,6 +22648,7 @@
               </w:rPr>
               <w:t>src</w:t>
             </w:r>
+            <w:proofErr w:type="spellEnd"/>
             <w:r>
               <w:rPr>
                 <w:rFonts w:ascii="Century Gothic" w:hAnsi="Century Gothic"/>
@@ -22657,7 +22679,7 @@
                 <w:color w:val="8A684A"/>
                 <w:shd w:val="clear" w:color="auto" w:fill="F5F0EB"/>
               </w:rPr>
-              <w:t>jobs</w:t>
+              <w:t>career</w:t>
             </w:r>
             <w:r>
               <w:rPr>
@@ -22667,6 +22689,7 @@
               </w:rPr>
               <w:t>\</w:t>
             </w:r>
+            <w:proofErr w:type="spellStart"/>
             <w:r>
               <w:rPr>
                 <w:rFonts w:ascii="Century Gothic" w:hAnsi="Century Gothic"/>
@@ -22675,6 +22698,7 @@
               </w:rPr>
               <w:t>index.ts</w:t>
             </w:r>
+            <w:proofErr w:type="spellEnd"/>
           </w:p>
         </w:tc>
       </w:tr>
@@ -22704,7 +22728,13 @@
               <w:rPr>
                 <w:rFonts w:ascii="Century Gothic" w:hAnsi="Century Gothic"/>
               </w:rPr>
-              <w:t>Jobs page formatting</w:t>
+              <w:t>Career</w:t>
+            </w:r>
+            <w:r>
+              <w:rPr>
+                <w:rFonts w:ascii="Century Gothic" w:hAnsi="Century Gothic"/>
+              </w:rPr>
+              <w:t xml:space="preserve"> page formatting</w:t>
             </w:r>
           </w:p>
         </w:tc>
@@ -22767,7 +22797,15 @@
                 <w:color w:val="8A684A"/>
                 <w:shd w:val="clear" w:color="auto" w:fill="F5F0EB"/>
               </w:rPr>
-              <w:t>Jobs.tsx</w:t>
+              <w:t>Career</w:t>
+            </w:r>
+            <w:r>
+              <w:rPr>
+                <w:rFonts w:ascii="Century Gothic" w:hAnsi="Century Gothic"/>
+                <w:color w:val="8A684A"/>
+                <w:shd w:val="clear" w:color="auto" w:fill="F5F0EB"/>
+              </w:rPr>
+              <w:t>.tsx</w:t>
             </w:r>
             <w:proofErr w:type="spellEnd"/>
           </w:p>
@@ -22815,6 +22853,7 @@
         </w:rPr>
         <w:t xml:space="preserve">Open </w:t>
       </w:r>
+      <w:proofErr w:type="spellStart"/>
       <w:r>
         <w:rPr>
           <w:rFonts w:ascii="Century Gothic" w:hAnsi="Century Gothic"/>
@@ -22825,6 +22864,7 @@
         </w:rPr>
         <w:t>src</w:t>
       </w:r>
+      <w:proofErr w:type="spellEnd"/>
       <w:r>
         <w:rPr>
           <w:rFonts w:ascii="Century Gothic" w:hAnsi="Century Gothic"/>
@@ -22863,7 +22903,7 @@
           <w:szCs w:val="18"/>
           <w:shd w:val="clear" w:color="auto" w:fill="F5F0EB"/>
         </w:rPr>
-        <w:t>jobs</w:t>
+        <w:t>career</w:t>
       </w:r>
       <w:r>
         <w:rPr>
@@ -22875,6 +22915,7 @@
         </w:rPr>
         <w:t>\</w:t>
       </w:r>
+      <w:proofErr w:type="spellStart"/>
       <w:r>
         <w:rPr>
           <w:rFonts w:ascii="Century Gothic" w:hAnsi="Century Gothic"/>
@@ -22885,6 +22926,7 @@
         </w:rPr>
         <w:t>index.ts</w:t>
       </w:r>
+      <w:proofErr w:type="spellEnd"/>
       <w:r>
         <w:rPr>
           <w:rFonts w:ascii="Century Gothic" w:hAnsi="Century Gothic"/>
@@ -22992,7 +23034,7 @@
           <w:rFonts w:ascii="Century Gothic" w:hAnsi="Century Gothic"/>
           <w:color w:val="495057"/>
         </w:rPr>
-        <w:t>job listing</w:t>
+        <w:t>listing</w:t>
       </w:r>
     </w:p>
     <w:p>
@@ -23012,6 +23054,7 @@
         </w:rPr>
         <w:t xml:space="preserve">Open </w:t>
       </w:r>
+      <w:proofErr w:type="spellStart"/>
       <w:r>
         <w:rPr>
           <w:rFonts w:ascii="Century Gothic" w:hAnsi="Century Gothic"/>
@@ -23022,6 +23065,7 @@
         </w:rPr>
         <w:t>src</w:t>
       </w:r>
+      <w:proofErr w:type="spellEnd"/>
       <w:r>
         <w:rPr>
           <w:rFonts w:ascii="Century Gothic" w:hAnsi="Century Gothic"/>
@@ -23060,7 +23104,7 @@
           <w:szCs w:val="18"/>
           <w:shd w:val="clear" w:color="auto" w:fill="F5F0EB"/>
         </w:rPr>
-        <w:t>jobs</w:t>
+        <w:t>career</w:t>
       </w:r>
       <w:r>
         <w:rPr>
@@ -23072,6 +23116,7 @@
         </w:rPr>
         <w:t>\</w:t>
       </w:r>
+      <w:proofErr w:type="spellStart"/>
       <w:r>
         <w:rPr>
           <w:rFonts w:ascii="Century Gothic" w:hAnsi="Century Gothic"/>
@@ -23082,6 +23127,7 @@
         </w:rPr>
         <w:t>index.ts</w:t>
       </w:r>
+      <w:proofErr w:type="spellEnd"/>
       <w:r>
         <w:rPr>
           <w:rFonts w:ascii="Century Gothic" w:hAnsi="Century Gothic"/>
@@ -23115,7 +23161,17 @@
           <w:szCs w:val="18"/>
           <w:shd w:val="clear" w:color="auto" w:fill="F5F0EB"/>
         </w:rPr>
-        <w:t>jobListings</w:t>
+        <w:t>career</w:t>
+      </w:r>
+      <w:r>
+        <w:rPr>
+          <w:rFonts w:ascii="Century Gothic" w:hAnsi="Century Gothic"/>
+          <w:color w:val="8A684A"/>
+          <w:sz w:val="18"/>
+          <w:szCs w:val="18"/>
+          <w:shd w:val="clear" w:color="auto" w:fill="F5F0EB"/>
+        </w:rPr>
+        <w:t>Listings</w:t>
       </w:r>
       <w:proofErr w:type="spellEnd"/>
       <w:r>
@@ -23151,7 +23207,17 @@
           <w:szCs w:val="18"/>
           <w:shd w:val="clear" w:color="auto" w:fill="F5F0EB"/>
         </w:rPr>
-        <w:t>jobListings</w:t>
+        <w:t>career</w:t>
+      </w:r>
+      <w:r>
+        <w:rPr>
+          <w:rFonts w:ascii="Century Gothic" w:hAnsi="Century Gothic"/>
+          <w:color w:val="8A684A"/>
+          <w:sz w:val="18"/>
+          <w:szCs w:val="18"/>
+          <w:shd w:val="clear" w:color="auto" w:fill="F5F0EB"/>
+        </w:rPr>
+        <w:t>Listings</w:t>
       </w:r>
       <w:proofErr w:type="spellEnd"/>
       <w:r>
@@ -23248,14 +23314,14 @@
           <w:rFonts w:ascii="Century Gothic" w:hAnsi="Century Gothic"/>
           <w:color w:val="495057"/>
         </w:rPr>
-        <w:t xml:space="preserve"> a </w:t>
+        <w:t xml:space="preserve"> a</w:t>
       </w:r>
       <w:r>
         <w:rPr>
           <w:rFonts w:ascii="Century Gothic" w:hAnsi="Century Gothic"/>
           <w:color w:val="495057"/>
         </w:rPr>
-        <w:t>job listing</w:t>
+        <w:t xml:space="preserve"> listing</w:t>
       </w:r>
     </w:p>
     <w:p>
@@ -23275,6 +23341,7 @@
         </w:rPr>
         <w:t xml:space="preserve">Open </w:t>
       </w:r>
+      <w:proofErr w:type="spellStart"/>
       <w:r>
         <w:rPr>
           <w:rFonts w:ascii="Century Gothic" w:hAnsi="Century Gothic"/>
@@ -23285,6 +23352,7 @@
         </w:rPr>
         <w:t>src</w:t>
       </w:r>
+      <w:proofErr w:type="spellEnd"/>
       <w:r>
         <w:rPr>
           <w:rFonts w:ascii="Century Gothic" w:hAnsi="Century Gothic"/>
@@ -23323,7 +23391,7 @@
           <w:szCs w:val="18"/>
           <w:shd w:val="clear" w:color="auto" w:fill="F5F0EB"/>
         </w:rPr>
-        <w:t>jobs</w:t>
+        <w:t>career</w:t>
       </w:r>
       <w:r>
         <w:rPr>
@@ -23335,6 +23403,7 @@
         </w:rPr>
         <w:t>\</w:t>
       </w:r>
+      <w:proofErr w:type="spellStart"/>
       <w:r>
         <w:rPr>
           <w:rFonts w:ascii="Century Gothic" w:hAnsi="Century Gothic"/>
@@ -23345,6 +23414,7 @@
         </w:rPr>
         <w:t>index.ts</w:t>
       </w:r>
+      <w:proofErr w:type="spellEnd"/>
       <w:r>
         <w:rPr>
           <w:rFonts w:ascii="Century Gothic" w:hAnsi="Century Gothic"/>
@@ -23367,7 +23437,7 @@
         <w:rPr>
           <w:rFonts w:ascii="Century Gothic" w:hAnsi="Century Gothic"/>
         </w:rPr>
-        <w:t xml:space="preserve">Delete the unwanted job listing entry in </w:t>
+        <w:t xml:space="preserve">Delete the unwanted listing entry in </w:t>
       </w:r>
       <w:proofErr w:type="spellStart"/>
       <w:r>
@@ -23378,7 +23448,17 @@
           <w:szCs w:val="18"/>
           <w:shd w:val="clear" w:color="auto" w:fill="F5F0EB"/>
         </w:rPr>
-        <w:t>jobListings</w:t>
+        <w:t>career</w:t>
+      </w:r>
+      <w:r>
+        <w:rPr>
+          <w:rFonts w:ascii="Century Gothic" w:hAnsi="Century Gothic"/>
+          <w:color w:val="8A684A"/>
+          <w:sz w:val="18"/>
+          <w:szCs w:val="18"/>
+          <w:shd w:val="clear" w:color="auto" w:fill="F5F0EB"/>
+        </w:rPr>
+        <w:t>Listings</w:t>
       </w:r>
       <w:proofErr w:type="spellEnd"/>
       <w:r>
@@ -23410,7 +23490,17 @@
           <w:szCs w:val="18"/>
           <w:shd w:val="clear" w:color="auto" w:fill="F5F0EB"/>
         </w:rPr>
-        <w:t>jobListings</w:t>
+        <w:t>career</w:t>
+      </w:r>
+      <w:r>
+        <w:rPr>
+          <w:rFonts w:ascii="Century Gothic" w:hAnsi="Century Gothic"/>
+          <w:color w:val="8A684A"/>
+          <w:sz w:val="18"/>
+          <w:szCs w:val="18"/>
+          <w:shd w:val="clear" w:color="auto" w:fill="F5F0EB"/>
+        </w:rPr>
+        <w:t>Listings</w:t>
       </w:r>
       <w:proofErr w:type="spellEnd"/>
       <w:r>
@@ -23481,17 +23571,7 @@
           <w:szCs w:val="18"/>
           <w:shd w:val="clear" w:color="auto" w:fill="F5F0EB"/>
         </w:rPr>
-        <w:t>j</w:t>
-      </w:r>
-      <w:r>
-        <w:rPr>
-          <w:rFonts w:ascii="Century Gothic" w:hAnsi="Century Gothic"/>
-          <w:color w:val="8A684A"/>
-          <w:sz w:val="18"/>
-          <w:szCs w:val="18"/>
-          <w:shd w:val="clear" w:color="auto" w:fill="F5F0EB"/>
-        </w:rPr>
-        <w:t>ob</w:t>
+        <w:t>career</w:t>
       </w:r>
       <w:r>
         <w:rPr>
@@ -28843,6 +28923,7 @@
   <w:style w:type="character" w:default="1" w:styleId="DefaultParagraphFont">
     <w:name w:val="Default Paragraph Font"/>
     <w:uiPriority w:val="1"/>
+    <w:semiHidden/>
     <w:unhideWhenUsed/>
   </w:style>
   <w:style w:type="table" w:default="1" w:styleId="TableNormal">

</xml_diff>

<commit_message>
Update team content and optimize website
</commit_message>
<xml_diff>
--- a/docs/Website_Editing_and_Publishing_Manual.docx
+++ b/docs/Website_Editing_and_Publishing_Manual.docx
@@ -365,7 +365,7 @@
         </w:rPr>
         <w:fldChar w:fldCharType="separate"/>
       </w:r>
-      <w:hyperlink w:anchor="_Toc239409652" w:history="1">
+      <w:hyperlink w:anchor="_Toc239848991" w:history="1">
         <w:r>
           <w:rPr>
             <w:rStyle w:val="Hyperlink"/>
@@ -413,7 +413,7 @@
             <w:noProof/>
             <w:webHidden/>
           </w:rPr>
-          <w:instrText xml:space="preserve"> PAGEREF _Toc239409652 \h </w:instrText>
+          <w:instrText xml:space="preserve"> PAGEREF _Toc239848991 \h </w:instrText>
         </w:r>
         <w:r>
           <w:rPr>
@@ -457,7 +457,7 @@
           <w14:ligatures w14:val="standardContextual"/>
         </w:rPr>
       </w:pPr>
-      <w:hyperlink w:anchor="_Toc239409653" w:history="1">
+      <w:hyperlink w:anchor="_Toc239848992" w:history="1">
         <w:r>
           <w:rPr>
             <w:rStyle w:val="Hyperlink"/>
@@ -505,7 +505,7 @@
             <w:noProof/>
             <w:webHidden/>
           </w:rPr>
-          <w:instrText xml:space="preserve"> PAGEREF _Toc239409653 \h </w:instrText>
+          <w:instrText xml:space="preserve"> PAGEREF _Toc239848992 \h </w:instrText>
         </w:r>
         <w:r>
           <w:rPr>
@@ -549,7 +549,7 @@
           <w14:ligatures w14:val="standardContextual"/>
         </w:rPr>
       </w:pPr>
-      <w:hyperlink w:anchor="_Toc239409654" w:history="1">
+      <w:hyperlink w:anchor="_Toc239848993" w:history="1">
         <w:r>
           <w:rPr>
             <w:rStyle w:val="Hyperlink"/>
@@ -597,7 +597,7 @@
             <w:noProof/>
             <w:webHidden/>
           </w:rPr>
-          <w:instrText xml:space="preserve"> PAGEREF _Toc239409654 \h </w:instrText>
+          <w:instrText xml:space="preserve"> PAGEREF _Toc239848993 \h </w:instrText>
         </w:r>
         <w:r>
           <w:rPr>
@@ -641,7 +641,7 @@
           <w14:ligatures w14:val="standardContextual"/>
         </w:rPr>
       </w:pPr>
-      <w:hyperlink w:anchor="_Toc239409655" w:history="1">
+      <w:hyperlink w:anchor="_Toc239848994" w:history="1">
         <w:r>
           <w:rPr>
             <w:rStyle w:val="Hyperlink"/>
@@ -689,7 +689,7 @@
             <w:noProof/>
             <w:webHidden/>
           </w:rPr>
-          <w:instrText xml:space="preserve"> PAGEREF _Toc239409655 \h </w:instrText>
+          <w:instrText xml:space="preserve"> PAGEREF _Toc239848994 \h </w:instrText>
         </w:r>
         <w:r>
           <w:rPr>
@@ -733,7 +733,7 @@
           <w14:ligatures w14:val="standardContextual"/>
         </w:rPr>
       </w:pPr>
-      <w:hyperlink w:anchor="_Toc239409656" w:history="1">
+      <w:hyperlink w:anchor="_Toc239848995" w:history="1">
         <w:r>
           <w:rPr>
             <w:rStyle w:val="Hyperlink"/>
@@ -781,7 +781,7 @@
             <w:noProof/>
             <w:webHidden/>
           </w:rPr>
-          <w:instrText xml:space="preserve"> PAGEREF _Toc239409656 \h </w:instrText>
+          <w:instrText xml:space="preserve"> PAGEREF _Toc239848995 \h </w:instrText>
         </w:r>
         <w:r>
           <w:rPr>
@@ -825,7 +825,7 @@
           <w14:ligatures w14:val="standardContextual"/>
         </w:rPr>
       </w:pPr>
-      <w:hyperlink w:anchor="_Toc239409657" w:history="1">
+      <w:hyperlink w:anchor="_Toc239848996" w:history="1">
         <w:r>
           <w:rPr>
             <w:rStyle w:val="Hyperlink"/>
@@ -873,7 +873,7 @@
             <w:noProof/>
             <w:webHidden/>
           </w:rPr>
-          <w:instrText xml:space="preserve"> PAGEREF _Toc239409657 \h </w:instrText>
+          <w:instrText xml:space="preserve"> PAGEREF _Toc239848996 \h </w:instrText>
         </w:r>
         <w:r>
           <w:rPr>
@@ -917,7 +917,7 @@
           <w14:ligatures w14:val="standardContextual"/>
         </w:rPr>
       </w:pPr>
-      <w:hyperlink w:anchor="_Toc239409658" w:history="1">
+      <w:hyperlink w:anchor="_Toc239848997" w:history="1">
         <w:r>
           <w:rPr>
             <w:rStyle w:val="Hyperlink"/>
@@ -965,7 +965,7 @@
             <w:noProof/>
             <w:webHidden/>
           </w:rPr>
-          <w:instrText xml:space="preserve"> PAGEREF _Toc239409658 \h </w:instrText>
+          <w:instrText xml:space="preserve"> PAGEREF _Toc239848997 \h </w:instrText>
         </w:r>
         <w:r>
           <w:rPr>
@@ -1009,7 +1009,7 @@
           <w14:ligatures w14:val="standardContextual"/>
         </w:rPr>
       </w:pPr>
-      <w:hyperlink w:anchor="_Toc239409659" w:history="1">
+      <w:hyperlink w:anchor="_Toc239848998" w:history="1">
         <w:r>
           <w:rPr>
             <w:rStyle w:val="Hyperlink"/>
@@ -1057,7 +1057,7 @@
             <w:noProof/>
             <w:webHidden/>
           </w:rPr>
-          <w:instrText xml:space="preserve"> PAGEREF _Toc239409659 \h </w:instrText>
+          <w:instrText xml:space="preserve"> PAGEREF _Toc239848998 \h </w:instrText>
         </w:r>
         <w:r>
           <w:rPr>
@@ -1101,7 +1101,7 @@
           <w14:ligatures w14:val="standardContextual"/>
         </w:rPr>
       </w:pPr>
-      <w:hyperlink w:anchor="_Toc239409660" w:history="1">
+      <w:hyperlink w:anchor="_Toc239848999" w:history="1">
         <w:r>
           <w:rPr>
             <w:rStyle w:val="Hyperlink"/>
@@ -1149,7 +1149,7 @@
             <w:noProof/>
             <w:webHidden/>
           </w:rPr>
-          <w:instrText xml:space="preserve"> PAGEREF _Toc239409660 \h </w:instrText>
+          <w:instrText xml:space="preserve"> PAGEREF _Toc239848999 \h </w:instrText>
         </w:r>
         <w:r>
           <w:rPr>
@@ -1193,7 +1193,7 @@
           <w14:ligatures w14:val="standardContextual"/>
         </w:rPr>
       </w:pPr>
-      <w:hyperlink w:anchor="_Toc239409661" w:history="1">
+      <w:hyperlink w:anchor="_Toc239849000" w:history="1">
         <w:r>
           <w:rPr>
             <w:rStyle w:val="Hyperlink"/>
@@ -1241,7 +1241,7 @@
             <w:noProof/>
             <w:webHidden/>
           </w:rPr>
-          <w:instrText xml:space="preserve"> PAGEREF _Toc239409661 \h </w:instrText>
+          <w:instrText xml:space="preserve"> PAGEREF _Toc239849000 \h </w:instrText>
         </w:r>
         <w:r>
           <w:rPr>
@@ -1285,7 +1285,7 @@
           <w14:ligatures w14:val="standardContextual"/>
         </w:rPr>
       </w:pPr>
-      <w:hyperlink w:anchor="_Toc239409662" w:history="1">
+      <w:hyperlink w:anchor="_Toc239849001" w:history="1">
         <w:r>
           <w:rPr>
             <w:rStyle w:val="Hyperlink"/>
@@ -1333,7 +1333,7 @@
             <w:noProof/>
             <w:webHidden/>
           </w:rPr>
-          <w:instrText xml:space="preserve"> PAGEREF _Toc239409662 \h </w:instrText>
+          <w:instrText xml:space="preserve"> PAGEREF _Toc239849001 \h </w:instrText>
         </w:r>
         <w:r>
           <w:rPr>
@@ -1377,7 +1377,7 @@
           <w14:ligatures w14:val="standardContextual"/>
         </w:rPr>
       </w:pPr>
-      <w:hyperlink w:anchor="_Toc239409663" w:history="1">
+      <w:hyperlink w:anchor="_Toc239849002" w:history="1">
         <w:r>
           <w:rPr>
             <w:rStyle w:val="Hyperlink"/>
@@ -1404,7 +1404,7 @@
             <w:rFonts w:ascii="Century Gothic" w:hAnsi="Century Gothic"/>
             <w:noProof/>
           </w:rPr>
-          <w:t>Jobs page</w:t>
+          <w:t>Career page</w:t>
         </w:r>
         <w:r>
           <w:rPr>
@@ -1425,7 +1425,7 @@
             <w:noProof/>
             <w:webHidden/>
           </w:rPr>
-          <w:instrText xml:space="preserve"> PAGEREF _Toc239409663 \h </w:instrText>
+          <w:instrText xml:space="preserve"> PAGEREF _Toc239849002 \h </w:instrText>
         </w:r>
         <w:r>
           <w:rPr>
@@ -1469,7 +1469,7 @@
           <w14:ligatures w14:val="standardContextual"/>
         </w:rPr>
       </w:pPr>
-      <w:hyperlink w:anchor="_Toc239409664" w:history="1">
+      <w:hyperlink w:anchor="_Toc239849003" w:history="1">
         <w:r>
           <w:rPr>
             <w:rStyle w:val="Hyperlink"/>
@@ -1517,7 +1517,7 @@
             <w:noProof/>
             <w:webHidden/>
           </w:rPr>
-          <w:instrText xml:space="preserve"> PAGEREF _Toc239409664 \h </w:instrText>
+          <w:instrText xml:space="preserve"> PAGEREF _Toc239849003 \h </w:instrText>
         </w:r>
         <w:r>
           <w:rPr>
@@ -1561,7 +1561,7 @@
           <w14:ligatures w14:val="standardContextual"/>
         </w:rPr>
       </w:pPr>
-      <w:hyperlink w:anchor="_Toc239409665" w:history="1">
+      <w:hyperlink w:anchor="_Toc239849004" w:history="1">
         <w:r>
           <w:rPr>
             <w:rStyle w:val="Hyperlink"/>
@@ -1609,7 +1609,7 @@
             <w:noProof/>
             <w:webHidden/>
           </w:rPr>
-          <w:instrText xml:space="preserve"> PAGEREF _Toc239409665 \h </w:instrText>
+          <w:instrText xml:space="preserve"> PAGEREF _Toc239849004 \h </w:instrText>
         </w:r>
         <w:r>
           <w:rPr>
@@ -1653,7 +1653,7 @@
           <w14:ligatures w14:val="standardContextual"/>
         </w:rPr>
       </w:pPr>
-      <w:hyperlink w:anchor="_Toc239409666" w:history="1">
+      <w:hyperlink w:anchor="_Toc239849005" w:history="1">
         <w:r>
           <w:rPr>
             <w:rStyle w:val="Hyperlink"/>
@@ -1701,7 +1701,7 @@
             <w:noProof/>
             <w:webHidden/>
           </w:rPr>
-          <w:instrText xml:space="preserve"> PAGEREF _Toc239409666 \h </w:instrText>
+          <w:instrText xml:space="preserve"> PAGEREF _Toc239849005 \h </w:instrText>
         </w:r>
         <w:r>
           <w:rPr>
@@ -1745,7 +1745,7 @@
           <w14:ligatures w14:val="standardContextual"/>
         </w:rPr>
       </w:pPr>
-      <w:hyperlink w:anchor="_Toc239409667" w:history="1">
+      <w:hyperlink w:anchor="_Toc239849006" w:history="1">
         <w:r>
           <w:rPr>
             <w:rStyle w:val="Hyperlink"/>
@@ -1793,7 +1793,7 @@
             <w:noProof/>
             <w:webHidden/>
           </w:rPr>
-          <w:instrText xml:space="preserve"> PAGEREF _Toc239409667 \h </w:instrText>
+          <w:instrText xml:space="preserve"> PAGEREF _Toc239849006 \h </w:instrText>
         </w:r>
         <w:r>
           <w:rPr>
@@ -1906,7 +1906,7 @@
           <w:rFonts w:ascii="Century Gothic" w:hAnsi="Century Gothic"/>
         </w:rPr>
       </w:pPr>
-      <w:bookmarkStart w:id="0" w:name="_Toc239409652"/>
+      <w:bookmarkStart w:id="0" w:name="_Toc239848991"/>
       <w:r>
         <w:rPr>
           <w:rFonts w:ascii="Century Gothic" w:hAnsi="Century Gothic"/>
@@ -2946,7 +2946,7 @@
           <w:rFonts w:ascii="Century Gothic" w:hAnsi="Century Gothic"/>
         </w:rPr>
       </w:pPr>
-      <w:bookmarkStart w:id="1" w:name="_Toc239409653"/>
+      <w:bookmarkStart w:id="1" w:name="_Toc239848992"/>
       <w:r>
         <w:rPr>
           <w:rFonts w:ascii="Century Gothic" w:hAnsi="Century Gothic"/>
@@ -4015,7 +4015,7 @@
           <w:rFonts w:ascii="Century Gothic" w:hAnsi="Century Gothic"/>
         </w:rPr>
       </w:pPr>
-      <w:bookmarkStart w:id="2" w:name="_Toc239409654"/>
+      <w:bookmarkStart w:id="2" w:name="_Toc239848993"/>
       <w:r>
         <w:rPr>
           <w:rFonts w:ascii="Century Gothic" w:hAnsi="Century Gothic"/>
@@ -6045,7 +6045,7 @@
           <w:rFonts w:ascii="Century Gothic" w:hAnsi="Century Gothic"/>
         </w:rPr>
       </w:pPr>
-      <w:bookmarkStart w:id="3" w:name="_Toc239409655"/>
+      <w:bookmarkStart w:id="3" w:name="_Toc239848994"/>
       <w:r>
         <w:rPr>
           <w:rFonts w:ascii="Century Gothic" w:hAnsi="Century Gothic"/>
@@ -7491,7 +7491,7 @@
           <w:rFonts w:ascii="Century Gothic" w:hAnsi="Century Gothic"/>
         </w:rPr>
       </w:pPr>
-      <w:bookmarkStart w:id="4" w:name="_Toc239409656"/>
+      <w:bookmarkStart w:id="4" w:name="_Toc239848995"/>
       <w:r>
         <w:rPr>
           <w:rFonts w:ascii="Century Gothic" w:hAnsi="Century Gothic"/>
@@ -8760,7 +8760,7 @@
           <w:rFonts w:ascii="Century Gothic" w:hAnsi="Century Gothic"/>
         </w:rPr>
       </w:pPr>
-      <w:bookmarkStart w:id="5" w:name="_Toc239409657"/>
+      <w:bookmarkStart w:id="5" w:name="_Toc239848996"/>
       <w:r>
         <w:rPr>
           <w:rFonts w:ascii="Century Gothic" w:hAnsi="Century Gothic"/>
@@ -10943,7 +10943,7 @@
           <w:rFonts w:ascii="Century Gothic" w:hAnsi="Century Gothic"/>
         </w:rPr>
       </w:pPr>
-      <w:bookmarkStart w:id="6" w:name="_Toc239409658"/>
+      <w:bookmarkStart w:id="6" w:name="_Toc239848997"/>
       <w:r>
         <w:rPr>
           <w:rFonts w:ascii="Century Gothic" w:hAnsi="Century Gothic"/>
@@ -12615,7 +12615,7 @@
           <w:rFonts w:ascii="Century Gothic" w:hAnsi="Century Gothic"/>
         </w:rPr>
       </w:pPr>
-      <w:bookmarkStart w:id="7" w:name="_Toc239409659"/>
+      <w:bookmarkStart w:id="7" w:name="_Toc239848998"/>
       <w:r>
         <w:rPr>
           <w:rFonts w:ascii="Century Gothic" w:hAnsi="Century Gothic"/>
@@ -15552,7 +15552,7 @@
           <w:rFonts w:ascii="Century Gothic" w:hAnsi="Century Gothic"/>
         </w:rPr>
       </w:pPr>
-      <w:bookmarkStart w:id="8" w:name="_Toc239409660"/>
+      <w:bookmarkStart w:id="8" w:name="_Toc239848999"/>
       <w:r>
         <w:rPr>
           <w:rFonts w:ascii="Century Gothic" w:hAnsi="Century Gothic"/>
@@ -17118,7 +17118,7 @@
           <w:rFonts w:ascii="Century Gothic" w:hAnsi="Century Gothic"/>
         </w:rPr>
       </w:pPr>
-      <w:bookmarkStart w:id="9" w:name="_Toc239409661"/>
+      <w:bookmarkStart w:id="9" w:name="_Toc239849000"/>
       <w:r>
         <w:rPr>
           <w:rFonts w:ascii="Century Gothic" w:hAnsi="Century Gothic"/>
@@ -21837,7 +21837,7 @@
           <w:rFonts w:ascii="Century Gothic" w:hAnsi="Century Gothic"/>
         </w:rPr>
       </w:pPr>
-      <w:bookmarkStart w:id="10" w:name="_Toc239409662"/>
+      <w:bookmarkStart w:id="10" w:name="_Toc239849001"/>
       <w:r>
         <w:rPr>
           <w:rFonts w:ascii="Century Gothic" w:hAnsi="Century Gothic"/>
@@ -22336,7 +22336,7 @@
           <w:rFonts w:ascii="Century Gothic" w:hAnsi="Century Gothic"/>
         </w:rPr>
       </w:pPr>
-      <w:bookmarkStart w:id="11" w:name="_Toc239409663"/>
+      <w:bookmarkStart w:id="11" w:name="_Toc239849002"/>
       <w:r>
         <w:rPr>
           <w:rFonts w:ascii="Century Gothic" w:hAnsi="Century Gothic"/>
@@ -22833,7 +22833,7 @@
           <w:rFonts w:ascii="Century Gothic" w:hAnsi="Century Gothic"/>
           <w:color w:val="495057"/>
         </w:rPr>
-        <w:t>job listing</w:t>
+        <w:t>listing</w:t>
       </w:r>
     </w:p>
     <w:p>
@@ -23657,7 +23657,7 @@
           <w:rFonts w:ascii="Century Gothic" w:hAnsi="Century Gothic"/>
         </w:rPr>
       </w:pPr>
-      <w:bookmarkStart w:id="12" w:name="_Toc239409664"/>
+      <w:bookmarkStart w:id="12" w:name="_Toc239849003"/>
       <w:r>
         <w:rPr>
           <w:rFonts w:ascii="Century Gothic" w:hAnsi="Century Gothic"/>
@@ -24507,7 +24507,7 @@
           <w:rFonts w:ascii="Century Gothic" w:hAnsi="Century Gothic"/>
         </w:rPr>
       </w:pPr>
-      <w:bookmarkStart w:id="13" w:name="_Toc239409665"/>
+      <w:bookmarkStart w:id="13" w:name="_Toc239849004"/>
       <w:r>
         <w:rPr>
           <w:rFonts w:ascii="Century Gothic" w:hAnsi="Century Gothic"/>
@@ -25301,7 +25301,7 @@
           <w:rFonts w:ascii="Century Gothic" w:hAnsi="Century Gothic"/>
         </w:rPr>
       </w:pPr>
-      <w:bookmarkStart w:id="14" w:name="_Toc239409666"/>
+      <w:bookmarkStart w:id="14" w:name="_Toc239849005"/>
       <w:r>
         <w:rPr>
           <w:rFonts w:ascii="Century Gothic" w:hAnsi="Century Gothic"/>
@@ -25718,7 +25718,7 @@
           <w:rFonts w:ascii="Century Gothic" w:hAnsi="Century Gothic"/>
         </w:rPr>
       </w:pPr>
-      <w:bookmarkStart w:id="15" w:name="_Toc239409667"/>
+      <w:bookmarkStart w:id="15" w:name="_Toc239849006"/>
       <w:r>
         <w:rPr>
           <w:rFonts w:ascii="Century Gothic" w:hAnsi="Century Gothic"/>

</xml_diff>